<commit_message>
feat: Add End-to-End Comprehensive Review Pipeline (One-Click 3-Way Audit)
</commit_message>
<xml_diff>
--- a/secure_local_data/공문_SWCM-NOTI-20260829-01.docx
+++ b/secure_local_data/공문_SWCM-NOTI-20260829-01.docx
@@ -187,7 +187,7 @@
           </w:tcPr>
           <w:p>
             <w:r>
-              <w:t>발주처 감독관, 품질관리팀장</w:t>
+              <w:t>발주처 감독관</w:t>
             </w:r>
           </w:p>
         </w:tc>
@@ -202,7 +202,7 @@
           <w:color w:val="1A365D"/>
           <w:sz w:val="24"/>
         </w:rPr>
-        <w:t>제　　목 : 지하 2층 가설 흙막이 시공계획서 검토결과 통보 및 보완 지시의 건</w:t>
+        <w:t>제　　목 : 가설 흙막이 시공계획서 검토결과 통보 및 보완 지시의 건</w:t>
       </w:r>
     </w:p>
     <w:p>

</xml_diff>